<commit_message>
Replace SSRN jury source with a fully open AustLII article
The SSRN page for the jury source exposed only an abstract, so both
Depp v Heard papers now cite Das, Aston and Rigby 2025 from the
University of Western Australia Law Review, whose full text is hosted
free on AustLII. Chapter text and reference lists updated to match.

Co-Authored-By: Claude Opus 5 <noreply@anthropic.com>
Claude-Session: https://claude.ai/code/session_01JBE53LuiqYDoXy9kPJLxew
</commit_message>
<xml_diff>
--- a/seminar-papers/עבודה - השידור החי של משפט דפ נגד הרד.docx
+++ b/seminar-papers/עבודה - השידור החי של משפט דפ נגד הרד.docx
@@ -949,7 +949,7 @@
           <w:szCs w:val="24"/>
           <w:rtl/>
         </w:rPr>
-        <w:t xml:space="preserve">הופמייסטר ווטס (Hoffmeister &amp; Watts, 2018) מראים שהאינטרנט והרשתות החברתיות שינו את התמונה מן היסוד. כיום המידע אינו מגיע רק מבחוץ אלא נמצא בכיסו של כל מושבע, והמחקר מתעד מקרים שבהם מושבעים חיפשו מידע על התיק ברשת, פרסמו עליו או קראו תגובות של אחרים. החוקרים מסבירים שהמניעים לכך אינם בהכרח זדוניים, אלא נובעים מהרגלי צריכת מידע שהפכו לאוטומטיים, ומצביעים על הקושי לאכוף איסורים בסביבה כזאת. עולה מכך שהגבול בין הקהל למושבעים נעשה נקבובי, ושהשאלה מי בעצם מכריע נעשית מורכבת. הפרק הבא מציג את המקרה שבו הדינמיקה הזאת הגיעה לשיאה.</w:t>
+        <w:t xml:space="preserve">דאס ואחרים (Das et al., 2025) מראים שהאינטרנט והרשתות החברתיות שינו את התמונה מן היסוד. כיום המידע אינו מגיע רק מבחוץ אלא נמצא בכיסו של כל מושבע, והמחקר מתעד מצבים שבהם מושבעים חיפשו מידע על התיק ברשת, נחשפו לעמדותיהם של אחרים או פרסמו בעצמם. החוקרים מסבירים שהמניעים לכך אינם בהכרח זדוניים, אלא נובעים מהרגלי צריכת מידע שהפכו לאוטומטיים, ומצביעים על הקושי לאכוף איסורים בסביבה כזאת. עולה מכך שהגבול בין הקהל למושבעים נעשה נקבובי, ושהשאלה מי בעצם מכריע נעשית מורכבת. הפרק הבא מציג את המקרה שבו הדינמיקה הזאת הגיעה לשיאה.</w:t>
       </w:r>
     </w:p>
     <w:p>
@@ -1169,7 +1169,7 @@
         <w:ind w:left="709"/>
         <w:jc w:val="left"/>
       </w:pPr>
-      <w:hyperlink w:history="1" r:id="rIdxmuttquvl3dynmtir3qez">
+      <w:hyperlink w:history="1" r:id="rId7ff4vl2ajexryvc1vtudz">
         <w:r>
           <w:rPr>
             <w:rStyle w:val="Hyperlink"/>
@@ -1230,7 +1230,7 @@
         <w:ind w:left="709"/>
         <w:jc w:val="left"/>
       </w:pPr>
-      <w:hyperlink w:history="1" r:id="rIdxchvwpel4t4qh0wxz9thh">
+      <w:hyperlink w:history="1" r:id="rId4uivnm9m78on2vg-z-lbj">
         <w:r>
           <w:rPr>
             <w:rStyle w:val="Hyperlink"/>
@@ -1291,7 +1291,7 @@
         <w:ind w:left="709"/>
         <w:jc w:val="left"/>
       </w:pPr>
-      <w:hyperlink w:history="1" r:id="rIdc0hbrhi_t3ua0bdcdtpny">
+      <w:hyperlink w:history="1" r:id="rIdb4r5ons0jc0l7iwoiidk6">
         <w:r>
           <w:rPr>
             <w:rStyle w:val="Hyperlink"/>
@@ -1319,7 +1319,7 @@
           <w:szCs w:val="24"/>
           <w:rtl w:val="false"/>
         </w:rPr>
-        <w:t xml:space="preserve">Hoffmeister, T., &amp; Watts, A. C. (2018). Social media, the internet, and trial by jury. </w:t>
+        <w:t xml:space="preserve">Das, C. A., Aston, J., &amp; Rigby, H. (2025). #australianjury#socialmedia: Natural justice on trial. </w:t>
       </w:r>
       <w:r>
         <w:rPr>
@@ -1331,7 +1331,7 @@
           <w:szCs w:val="24"/>
           <w:rtl w:val="false"/>
         </w:rPr>
-        <w:t xml:space="preserve">Annual Review of Law and Social Science, 14</w:t>
+        <w:t xml:space="preserve">University of Western Australia Law Review, 53</w:t>
       </w:r>
       <w:r>
         <w:rPr>
@@ -1342,7 +1342,7 @@
           <w:szCs w:val="24"/>
           <w:rtl w:val="false"/>
         </w:rPr>
-        <w:t xml:space="preserve">, 259-270.</w:t>
+        <w:t xml:space="preserve">(1), 220-239.</w:t>
       </w:r>
     </w:p>
     <w:p>
@@ -1352,7 +1352,7 @@
         <w:ind w:left="709"/>
         <w:jc w:val="left"/>
       </w:pPr>
-      <w:hyperlink w:history="1" r:id="rIdi2srbsoy_ppockugbobdz">
+      <w:hyperlink w:history="1" r:id="rId4wjtah9v_lsfx-9rm0yeu">
         <w:r>
           <w:rPr>
             <w:rStyle w:val="Hyperlink"/>
@@ -1360,7 +1360,7 @@
             <w:sz w:val="22"/>
             <w:szCs w:val="22"/>
           </w:rPr>
-          <w:t xml:space="preserve">https://papers.ssrn.com/sol3/papers.cfm?abstract_id=3273809</w:t>
+          <w:t xml:space="preserve">https://www.austlii.edu.au/au/journals/UWALawRw/2025/11.pdf</w:t>
         </w:r>
       </w:hyperlink>
     </w:p>
@@ -1413,7 +1413,7 @@
         <w:ind w:left="709"/>
         <w:jc w:val="left"/>
       </w:pPr>
-      <w:hyperlink w:history="1" r:id="rIdjycqcnzywvdbtv0jod_27">
+      <w:hyperlink w:history="1" r:id="rIdjfjtt8dqfw0ru6wfer6pr">
         <w:r>
           <w:rPr>
             <w:rStyle w:val="Hyperlink"/>
@@ -1474,7 +1474,7 @@
         <w:ind w:left="709"/>
         <w:jc w:val="left"/>
       </w:pPr>
-      <w:hyperlink w:history="1" r:id="rIdvzvcburw_le7nujb-llbi">
+      <w:hyperlink w:history="1" r:id="rIdn3mfeikgaujih7jgkefbk">
         <w:r>
           <w:rPr>
             <w:rStyle w:val="Hyperlink"/>
@@ -1535,7 +1535,7 @@
         <w:ind w:left="709"/>
         <w:jc w:val="left"/>
       </w:pPr>
-      <w:hyperlink w:history="1" r:id="rIdl3dfrhhgo2wkgk86fne0_">
+      <w:hyperlink w:history="1" r:id="rIdr7qk9dahrxd-2eaxgtgbf">
         <w:r>
           <w:rPr>
             <w:rStyle w:val="Hyperlink"/>

</xml_diff>

<commit_message>
Complete Depp assignment appendices and correct the Nelson figures
Reading the supplied article pages showed the participation figures
previously attributed to Nelson were not in her article, so both Depp
papers now report only what the text states: the first large-scale
celebrity trial of the streaming age, the ruling that allowed filming,
the 3.5 million concurrent peak on verdict day with most viewers
outside the US, and the 113k-tweet dataset. The assignment now carries
one appendix per source, in order of appearance.

Co-Authored-By: Claude Opus 5 <noreply@anthropic.com>
Claude-Session: https://claude.ai/code/session_01JBE53LuiqYDoXy9kPJLxew
</commit_message>
<xml_diff>
--- a/seminar-papers/עבודה - השידור החי של משפט דפ נגד הרד.docx
+++ b/seminar-papers/עבודה - השידור החי של משפט דפ נגד הרד.docx
@@ -1023,7 +1023,7 @@
           <w:szCs w:val="24"/>
           <w:rtl/>
         </w:rPr>
-        <w:t xml:space="preserve">ההיקף התקשורתי של הפרשה היה חסר תקדים. נלסון (Nelson, 2025) מדווחת על יותר מ-18 מיליארד צפיות בתגית #JusticeForJohnnyDepp בטיקטוק, על 83.9 מיליון שעות צפייה בשידורי המשפט ביוטיוב, על יותר מ-17 מיליון פרסומים ברשת X ועל למעלה מ-12 אלף כתבות בתקשורת המרכזית. עוד היא מציינת כי חלק ניכר מן התוכן היה מכוון נגד הרד, ובכלל זה תוכן שיווקי שנבנה על גלי הלעג שהופנו אליה. הנתונים האלה מספקים את התשתית העובדתית לשאלה שבמוקד העבודה.</w:t>
+        <w:t xml:space="preserve">ההיקף התקשורתי של הפרשה היה חסר תקדים. נלסון (Nelson, 2025) מתארת את המשפט כמשפט הסלבריטאים רחב ההיקף הראשון של עידן הסטרימינג, ומציינת כי רשת Court TV קיבלה היתר לצלם את הדיונים לאחר שהשופטת קבעה כי ההגנות הנהוגות כלפי נפגעי עבירות מין אינן חלות בהליך אזרחי. לדבריה, ערוץ היוטיוב של Law and Crime Network היה זירת הצפייה הפופולרית ביותר, והגיע ביום הכרעת הדין לשיא של 3.5 מיליון צופים במקביל, כשכ-65 אחוזים מהם נמצאו מחוץ לארצות הברית. נלסון מוסיפה שריבוי המצלמות והזוויות אפשר מעקב צמוד אחר הבעות פנים ותגובות של המשתתפים, וכך הוזמנו הצופים לבחון כל פרט שהתרחש באולם. במקביל התפתח שיח רשתי עצום, שאותו היא בוחנת דרך מאגר של קרוב ל-113 אלף ציוצים, ובו נוצרו ממים, תיאוריות וכותרות שהופצו בטיקטוק, ביוטיוב ובטוויץ'. הנתונים האלה מספקים את התשתית העובדתית לשאלה שבמוקד העבודה.</w:t>
       </w:r>
     </w:p>
     <w:p>
@@ -1169,7 +1169,7 @@
         <w:ind w:left="709"/>
         <w:jc w:val="left"/>
       </w:pPr>
-      <w:hyperlink w:history="1" r:id="rId7ff4vl2ajexryvc1vtudz">
+      <w:hyperlink w:history="1" r:id="rIdpmkbiq9dwqv0kj2d4mmng">
         <w:r>
           <w:rPr>
             <w:rStyle w:val="Hyperlink"/>
@@ -1230,7 +1230,7 @@
         <w:ind w:left="709"/>
         <w:jc w:val="left"/>
       </w:pPr>
-      <w:hyperlink w:history="1" r:id="rId4uivnm9m78on2vg-z-lbj">
+      <w:hyperlink w:history="1" r:id="rIdq4_n8yyianrcbj1svpzfa">
         <w:r>
           <w:rPr>
             <w:rStyle w:val="Hyperlink"/>
@@ -1291,7 +1291,7 @@
         <w:ind w:left="709"/>
         <w:jc w:val="left"/>
       </w:pPr>
-      <w:hyperlink w:history="1" r:id="rIdb4r5ons0jc0l7iwoiidk6">
+      <w:hyperlink w:history="1" r:id="rIddbovhuflp6orprbmz1ba6">
         <w:r>
           <w:rPr>
             <w:rStyle w:val="Hyperlink"/>
@@ -1352,7 +1352,7 @@
         <w:ind w:left="709"/>
         <w:jc w:val="left"/>
       </w:pPr>
-      <w:hyperlink w:history="1" r:id="rId4wjtah9v_lsfx-9rm0yeu">
+      <w:hyperlink w:history="1" r:id="rIdbyr_otqkiihfhyxfkx1bh">
         <w:r>
           <w:rPr>
             <w:rStyle w:val="Hyperlink"/>
@@ -1413,7 +1413,7 @@
         <w:ind w:left="709"/>
         <w:jc w:val="left"/>
       </w:pPr>
-      <w:hyperlink w:history="1" r:id="rIdjfjtt8dqfw0ru6wfer6pr">
+      <w:hyperlink w:history="1" r:id="rIdub2fswpgmyfaq2f9ffr-3">
         <w:r>
           <w:rPr>
             <w:rStyle w:val="Hyperlink"/>
@@ -1474,7 +1474,7 @@
         <w:ind w:left="709"/>
         <w:jc w:val="left"/>
       </w:pPr>
-      <w:hyperlink w:history="1" r:id="rIdn3mfeikgaujih7jgkefbk">
+      <w:hyperlink w:history="1" r:id="rIdu5s5o1f5cm0akbjjqi44x">
         <w:r>
           <w:rPr>
             <w:rStyle w:val="Hyperlink"/>
@@ -1535,7 +1535,7 @@
         <w:ind w:left="709"/>
         <w:jc w:val="left"/>
       </w:pPr>
-      <w:hyperlink w:history="1" r:id="rIdr7qk9dahrxd-2eaxgtgbf">
+      <w:hyperlink w:history="1" r:id="rIdea-cfy9ckekgo_dgqe3ha">
         <w:r>
           <w:rPr>
             <w:rStyle w:val="Hyperlink"/>

</xml_diff>

<commit_message>
Add the college logo to every cover page
Crops the logo out of the supplied screenshot and places it centred at
the top of the title page in all six documents.

Co-Authored-By: Claude Opus 5 <noreply@anthropic.com>
Claude-Session: https://claude.ai/code/session_01JBE53LuiqYDoXy9kPJLxew
</commit_message>
<xml_diff>
--- a/seminar-papers/עבודה - השידור החי של משפט דפ נגד הרד.docx
+++ b/seminar-papers/עבודה - השידור החי של משפט דפ נגד הרד.docx
@@ -2,6 +2,52 @@
 <file path=word/document.xml><?xml version="1.0" encoding="utf-8"?>
 <w:document xmlns:wpc="http://schemas.microsoft.com/office/word/2010/wordprocessingCanvas" xmlns:mc="http://schemas.openxmlformats.org/markup-compatibility/2006" xmlns:o="urn:schemas-microsoft-com:office:office" xmlns:r="http://schemas.openxmlformats.org/officeDocument/2006/relationships" xmlns:m="http://schemas.openxmlformats.org/officeDocument/2006/math" xmlns:v="urn:schemas-microsoft-com:vml" xmlns:wp14="http://schemas.microsoft.com/office/word/2010/wordprocessingDrawing" xmlns:wp="http://schemas.openxmlformats.org/drawingml/2006/wordprocessingDrawing" xmlns:w10="urn:schemas-microsoft-com:office:word" xmlns:w="http://schemas.openxmlformats.org/wordprocessingml/2006/main" xmlns:w14="http://schemas.microsoft.com/office/word/2010/wordml" xmlns:w15="http://schemas.microsoft.com/office/word/2012/wordml" xmlns:wpg="http://schemas.microsoft.com/office/word/2010/wordprocessingGroup" xmlns:wpi="http://schemas.microsoft.com/office/word/2010/wordprocessingInk" xmlns:wne="http://schemas.microsoft.com/office/word/2006/wordml" xmlns:wps="http://schemas.microsoft.com/office/word/2010/wordprocessingShape" xmlns:cx="http://schemas.microsoft.com/office/drawing/2014/chartex" xmlns:cx1="http://schemas.microsoft.com/office/drawing/2015/9/8/chartex" xmlns:cx2="http://schemas.microsoft.com/office/drawing/2015/10/21/chartex" xmlns:cx3="http://schemas.microsoft.com/office/drawing/2016/5/9/chartex" xmlns:cx4="http://schemas.microsoft.com/office/drawing/2016/5/10/chartex" xmlns:cx5="http://schemas.microsoft.com/office/drawing/2016/5/11/chartex" xmlns:cx6="http://schemas.microsoft.com/office/drawing/2016/5/12/chartex" xmlns:cx7="http://schemas.microsoft.com/office/drawing/2016/5/13/chartex" xmlns:cx8="http://schemas.microsoft.com/office/drawing/2016/5/14/chartex" xmlns:aink="http://schemas.microsoft.com/office/drawing/2016/ink" xmlns:am3d="http://schemas.microsoft.com/office/drawing/2017/model3d" xmlns:w16cex="http://schemas.microsoft.com/office/word/2018/wordml/cex" xmlns:w16cid="http://schemas.microsoft.com/office/word/2016/wordml/cid" xmlns:w16="http://schemas.microsoft.com/office/word/2018/wordml" xmlns:w16sdtdh="http://schemas.microsoft.com/office/word/2020/wordml/sdtdatahash" xmlns:w16se="http://schemas.microsoft.com/office/word/2015/wordml/symex" mc:Ignorable="w14 w15 wp14">
   <w:body>
+    <w:p>
+      <w:pPr>
+        <w:spacing w:after="180"/>
+        <w:jc w:val="center"/>
+      </w:pPr>
+      <w:r>
+        <w:drawing>
+          <wp:inline distT="0" distB="0" distL="0" distR="0">
+            <wp:extent cx="1000125" cy="1000125"/>
+            <wp:effectExtent t="0" r="0" b="0" l="0"/>
+            <wp:docPr id="1" name="" descr="" title=""/>
+            <wp:cNvGraphicFramePr>
+              <a:graphicFrameLocks xmlns:a="http://schemas.openxmlformats.org/drawingml/2006/main" noChangeAspect="1"/>
+            </wp:cNvGraphicFramePr>
+            <a:graphic xmlns:a="http://schemas.openxmlformats.org/drawingml/2006/main">
+              <a:graphicData uri="http://schemas.openxmlformats.org/drawingml/2006/picture">
+                <pic:pic xmlns:pic="http://schemas.openxmlformats.org/drawingml/2006/picture">
+                  <pic:nvPicPr>
+                    <pic:cNvPr id="0" name="" descr=""/>
+                    <pic:cNvPicPr>
+                      <a:picLocks noChangeAspect="1" noChangeArrowheads="1"/>
+                    </pic:cNvPicPr>
+                  </pic:nvPicPr>
+                  <pic:blipFill>
+                    <a:blip r:embed="rId9" cstate="none"/>
+                    <a:srcRect/>
+                    <a:stretch>
+                      <a:fillRect/>
+                    </a:stretch>
+                  </pic:blipFill>
+                  <pic:spPr bwMode="auto">
+                    <a:xfrm>
+                      <a:off x="0" y="0"/>
+                      <a:ext cx="1000125" cy="1000125"/>
+                    </a:xfrm>
+                    <a:prstGeom prst="rect">
+                      <a:avLst/>
+                    </a:prstGeom>
+                  </pic:spPr>
+                </pic:pic>
+              </a:graphicData>
+            </a:graphic>
+          </wp:inline>
+        </w:drawing>
+      </w:r>
+    </w:p>
     <w:p>
       <w:pPr>
         <w:bidi/>
@@ -1169,7 +1215,7 @@
         <w:ind w:left="709"/>
         <w:jc w:val="left"/>
       </w:pPr>
-      <w:hyperlink w:history="1" r:id="rIdpmkbiq9dwqv0kj2d4mmng">
+      <w:hyperlink w:history="1" r:id="rIdpsoacvtf38xpfxjyxdmta">
         <w:r>
           <w:rPr>
             <w:rStyle w:val="Hyperlink"/>
@@ -1230,7 +1276,7 @@
         <w:ind w:left="709"/>
         <w:jc w:val="left"/>
       </w:pPr>
-      <w:hyperlink w:history="1" r:id="rIdq4_n8yyianrcbj1svpzfa">
+      <w:hyperlink w:history="1" r:id="rIdfruwuozp2ps4qychya8un">
         <w:r>
           <w:rPr>
             <w:rStyle w:val="Hyperlink"/>
@@ -1291,7 +1337,7 @@
         <w:ind w:left="709"/>
         <w:jc w:val="left"/>
       </w:pPr>
-      <w:hyperlink w:history="1" r:id="rIddbovhuflp6orprbmz1ba6">
+      <w:hyperlink w:history="1" r:id="rId40g0wvtmp-3dqlaf8y2g9">
         <w:r>
           <w:rPr>
             <w:rStyle w:val="Hyperlink"/>
@@ -1352,7 +1398,7 @@
         <w:ind w:left="709"/>
         <w:jc w:val="left"/>
       </w:pPr>
-      <w:hyperlink w:history="1" r:id="rIdbyr_otqkiihfhyxfkx1bh">
+      <w:hyperlink w:history="1" r:id="rIdeqci3u59jjgv9injvsvue">
         <w:r>
           <w:rPr>
             <w:rStyle w:val="Hyperlink"/>
@@ -1413,7 +1459,7 @@
         <w:ind w:left="709"/>
         <w:jc w:val="left"/>
       </w:pPr>
-      <w:hyperlink w:history="1" r:id="rIdub2fswpgmyfaq2f9ffr-3">
+      <w:hyperlink w:history="1" r:id="rIddvsc_eydfoa4km3c2g90d">
         <w:r>
           <w:rPr>
             <w:rStyle w:val="Hyperlink"/>
@@ -1474,7 +1520,7 @@
         <w:ind w:left="709"/>
         <w:jc w:val="left"/>
       </w:pPr>
-      <w:hyperlink w:history="1" r:id="rIdu5s5o1f5cm0akbjjqi44x">
+      <w:hyperlink w:history="1" r:id="rIdkq8g78oshf8ypr_zzna_w">
         <w:r>
           <w:rPr>
             <w:rStyle w:val="Hyperlink"/>
@@ -1535,7 +1581,7 @@
         <w:ind w:left="709"/>
         <w:jc w:val="left"/>
       </w:pPr>
-      <w:hyperlink w:history="1" r:id="rIdea-cfy9ckekgo_dgqe3ha">
+      <w:hyperlink w:history="1" r:id="rIdm5vmgq9pbsdv3qz0myeoy">
         <w:r>
           <w:rPr>
             <w:rStyle w:val="Hyperlink"/>

</xml_diff>